<commit_message>
organise lab files into weekly folders
</commit_message>
<xml_diff>
--- a/INF1103-Labs Screenshots.docx
+++ b/INF1103-Labs Screenshots.docx
@@ -24,21 +24,12 @@
           <w:lang w:val="en-US"/>
         </w:rPr>
       </w:pPr>
-      <w:proofErr w:type="gramStart"/>
       <w:r>
         <w:rPr>
           <w:rFonts w:ascii="Times New Roman" w:hAnsi="Times New Roman"/>
           <w:lang w:val="en-US"/>
         </w:rPr>
-        <w:t>Commit</w:t>
-      </w:r>
-      <w:proofErr w:type="gramEnd"/>
-      <w:r>
-        <w:rPr>
-          <w:rFonts w:ascii="Times New Roman" w:hAnsi="Times New Roman"/>
-          <w:lang w:val="en-US"/>
-        </w:rPr>
-        <w:t xml:space="preserve"> history:</w:t>
+        <w:t>Commit history:</w:t>
       </w:r>
     </w:p>
     <w:p>
@@ -54,10 +45,10 @@
           <w:lang w:val="en-US"/>
         </w:rPr>
         <w:drawing>
-          <wp:inline distT="0" distB="0" distL="0" distR="0" wp14:anchorId="64725F30" wp14:editId="74C33602">
-            <wp:extent cx="5731510" cy="3026410"/>
-            <wp:effectExtent l="0" t="0" r="2540" b="2540"/>
-            <wp:docPr id="1505916897" name="Picture 1"/>
+          <wp:inline distT="0" distB="0" distL="0" distR="0" wp14:anchorId="1B9BE20B" wp14:editId="0D4A643F">
+            <wp:extent cx="5731510" cy="2614295"/>
+            <wp:effectExtent l="0" t="0" r="2540" b="0"/>
+            <wp:docPr id="1009606568" name="Picture 1"/>
             <wp:cNvGraphicFramePr>
               <a:graphicFrameLocks xmlns:a="http://schemas.openxmlformats.org/drawingml/2006/main" noChangeAspect="1"/>
             </wp:cNvGraphicFramePr>
@@ -65,7 +56,7 @@
               <a:graphicData uri="http://schemas.openxmlformats.org/drawingml/2006/picture">
                 <pic:pic xmlns:pic="http://schemas.openxmlformats.org/drawingml/2006/picture">
                   <pic:nvPicPr>
-                    <pic:cNvPr id="1505916897" name=""/>
+                    <pic:cNvPr id="1009606568" name=""/>
                     <pic:cNvPicPr/>
                   </pic:nvPicPr>
                   <pic:blipFill>
@@ -77,7 +68,7 @@
                   <pic:spPr>
                     <a:xfrm>
                       <a:off x="0" y="0"/>
-                      <a:ext cx="5731510" cy="3026410"/>
+                      <a:ext cx="5731510" cy="2614295"/>
                     </a:xfrm>
                     <a:prstGeom prst="rect">
                       <a:avLst/>
@@ -262,6 +253,7 @@
       <w:r>
         <w:rPr>
           <w:rFonts w:ascii="Times New Roman" w:hAnsi="Times New Roman"/>
+          <w:noProof/>
           <w:lang w:val="en-US"/>
         </w:rPr>
         <w:drawing>

</xml_diff>